<commit_message>
Refine NASA forecasting analysis and reports
</commit_message>
<xml_diff>
--- a/Assignment Report/Group_Report.docx
+++ b/Assignment Report/Group_Report.docx
@@ -61,7 +61,7 @@
         <w:t xml:space="preserve">Abstract—</w:t>
       </w:r>
       <w:r>
-        <w:t xml:space="preserve">This study compares seasonal ARIMA, additive Holt–Winters, ETS, and trend-plus-season regression for forecasting monthly NASA POWER surface solar irradiance in Kuala Lumpur. Models are evaluated on a common January 2021–December 2025 test period using accuracy, residual diagnostics, and physical-plausibility checks. SARIMA achieved the strongest admissible result, although its advantage over ETS was modest.</w:t>
+        <w:t xml:space="preserve">This study compares ARIMA, Holt–Winters, ETS, and linear regression for forecasting monthly NASA POWER surface solar irradiance in Kuala Lumpur. Models are evaluated on a common January 2021–December 2025 test period using accuracy, residual diagnostics, and physical-plausibility checks. ARIMA achieved the strongest admissible result, although its advantage over ETS was modest.</w:t>
       </w:r>
     </w:p>
     <w:p>
@@ -76,7 +76,7 @@
         <w:t xml:space="preserve">Keywords—</w:t>
       </w:r>
       <w:r>
-        <w:t xml:space="preserve">ETS, forecasting, Holt–Winters, NASA POWER, regression, SARIMA, solar irradiance.</w:t>
+        <w:t xml:space="preserve">ARIMA, ETS, forecasting, Holt–Winters, linear regression, NASA POWER, solar irradiance.</w:t>
       </w:r>
     </w:p>
     <w:bookmarkStart w:id="22" w:name="introduction"/>
@@ -113,14 +113,9 @@
       <w:r>
         <w:t xml:space="preserve"> </w:t>
       </w:r>
-      <w:hyperlink w:anchor="ref-nasa-power-monthly">
-        <w:r>
-          <w:rPr>
-            <w:rStyle w:val="Hyperlink"/>
-          </w:rPr>
-          <w:t xml:space="preserve">[1]</w:t>
-        </w:r>
-      </w:hyperlink>
+      <w:r>
+        <w:t xml:space="preserve">[1]</w:t>
+      </w:r>
       <w:r>
         <w:t xml:space="preserve">. The dataset contains 300 continuous observations from January 2001 through December 2025 in kWh/m²/day.</w:t>
       </w:r>
@@ -130,7 +125,7 @@
         <w:pStyle w:val="BodyText"/>
       </w:pPr>
       <w:r>
-        <w:t xml:space="preserve">The objectives were to (1) audit and describe the monthly series; (2) fit and diagnose SARIMA, additive Holt–Winters, ETS, and multiple linear regression with trend and monthly effects; (3) compare locked specifications on a common 60-month chronological test using RMSE, MAE, MAPE, MASE, and sMAPE; and (4) interpret the selected model for solar-resource planning. The work supports United Nations Sustainable Development Goal 7,</w:t>
+        <w:t xml:space="preserve">The objectives were to (1) audit and describe the monthly series; (2) fit and diagnose ARIMA, Holt–Winters, ETS, and linear regression models; (3) compare the fitted models on a common 60-month chronological test using ME, MSE, RMSE, MAE, MPE, and MAPE; and (4) interpret the selected model for solar-resource planning. The work supports United Nations Sustainable Development Goal 7,</w:t>
       </w:r>
       <w:r>
         <w:t xml:space="preserve"> </w:t>
@@ -148,14 +143,9 @@
       <w:r>
         <w:t xml:space="preserve"> </w:t>
       </w:r>
-      <w:hyperlink w:anchor="ref-un-sdg7">
-        <w:r>
-          <w:rPr>
-            <w:rStyle w:val="Hyperlink"/>
-          </w:rPr>
-          <w:t xml:space="preserve">[2]</w:t>
-        </w:r>
-      </w:hyperlink>
+      <w:r>
+        <w:t xml:space="preserve">[2]</w:t>
+      </w:r>
       <w:r>
         <w:t xml:space="preserve">. Irradiance is a resource indicator, however, and is not equivalent to photovoltaic electricity output.</w:t>
       </w:r>
@@ -221,66 +211,22 @@
         <w:pStyle w:val="BodyText"/>
       </w:pPr>
       <w:r>
-        <w:t xml:space="preserve">The training series would be examined using time and seasonal plots, monthly summaries, STL decomposition, variance diagnostics, and differencing tests. Any need for a variance-stabilising transformation would be assessed from the training data by comparing transformed and untransformed diagnostics. This proposal-stage methodology specifies that decision process without reporting an estimated transformation value or other empirical outcome. SARIMA candidates would be searched seasonally and exhaustively (</w:t>
-      </w:r>
-      <w:r>
-        <w:rPr>
-          <w:rStyle w:val="VerbatimChar"/>
-        </w:rPr>
-        <w:t xml:space="preserve">stepwise = FALSE</w:t>
-      </w:r>
-      <w:r>
-        <w:t xml:space="preserve">,</w:t>
+        <w:t xml:space="preserve">The training series would be examined using time and seasonal plots, monthly summaries, decomposition, variance diagnostics, and differencing tests. Any need for a variance-stabilising transformation would be assessed from the training data by comparing transformed and untransformed diagnostics. This proposal-stage methodology specifies the decision process without reporting an estimated transformation value or other empirical outcome.</w:t>
+      </w:r>
+    </w:p>
+    <w:p>
+      <w:pPr>
+        <w:pStyle w:val="BodyText"/>
+      </w:pPr>
+      <w:r>
+        <w:t xml:space="preserve">Four basic forecasting models were selected for the research. ARIMA was selected because it can represent serial dependence and recurring patterns in a time series. Holt–Winters was selected because it can update the series level, trend, and seasonality through smoothing. ETS was selected because its state-space framework can represent changing components and forecast uncertainty. Linear regression was selected because it provides a clear and interpretable representation of trend and seasonal effects. Specific model variants, settings, and estimated parameters are reserved for the individual reports. Together, the four models provide broad coverage of serial-dependence, smoothing, state-space, and deterministic forecasting approaches</w:t>
       </w:r>
       <w:r>
         <w:t xml:space="preserve"> </w:t>
       </w:r>
       <w:r>
-        <w:rPr>
-          <w:rStyle w:val="VerbatimChar"/>
-        </w:rPr>
-        <w:t xml:space="preserve">approximation = FALSE</w:t>
-      </w:r>
-      <w:r>
-        <w:t xml:space="preserve">) with drift considered where valid. Holt–Winters would assess seasonal and trend components, ETS would search the error–trend–season space, and regression would use</w:t>
-      </w:r>
-      <w:r>
-        <w:t xml:space="preserve"> </w:t>
-      </w:r>
-      <w:r>
-        <w:rPr>
-          <w:rStyle w:val="VerbatimChar"/>
-        </w:rPr>
-        <w:t xml:space="preserve">y ~ trend + season</w:t>
-      </w:r>
-      <w:r>
-        <w:t xml:space="preserve">. These methods represent complementary serial-dependence, smoothing, state-space, and interpretable deterministic approaches</w:t>
-      </w:r>
-      <w:r>
-        <w:t xml:space="preserve"> </w:t>
-      </w:r>
-      <w:hyperlink w:anchor="ref-hyndman-athanasopoulos-2021">
-        <w:r>
-          <w:rPr>
-            <w:rStyle w:val="Hyperlink"/>
-          </w:rPr>
-          <w:t xml:space="preserve">[3]</w:t>
-        </w:r>
-      </w:hyperlink>
-      <w:r>
-        <w:t xml:space="preserve">,</w:t>
-      </w:r>
-      <w:r>
-        <w:t xml:space="preserve"> </w:t>
-      </w:r>
-      <w:hyperlink w:anchor="ref-hyndman-khandakar-2008">
-        <w:r>
-          <w:rPr>
-            <w:rStyle w:val="Hyperlink"/>
-          </w:rPr>
-          <w:t xml:space="preserve">[4]</w:t>
-        </w:r>
-      </w:hyperlink>
+        <w:t xml:space="preserve">[3], [4]</w:t>
+      </w:r>
       <w:r>
         <w:t xml:space="preserve">.</w:t>
       </w:r>
@@ -304,16 +250,11 @@
       <w:r>
         <w:t xml:space="preserve"> </w:t>
       </w:r>
-      <w:hyperlink w:anchor="ref-forecast-residuals">
-        <w:r>
-          <w:rPr>
-            <w:rStyle w:val="Hyperlink"/>
-          </w:rPr>
-          <w:t xml:space="preserve">[5]</w:t>
-        </w:r>
-      </w:hyperlink>
-      <w:r>
-        <w:t xml:space="preserve">. Residual time plots, ACFs, and Ljung–Box tests at lag 24 would be evaluated with fitted degrees of freedom;</w:t>
+      <w:r>
+        <w:t xml:space="preserve">[5]</w:t>
+      </w:r>
+      <w:r>
+        <w:t xml:space="preserve">. The common accuracy set would comprise ME, MSE, RMSE, MAE, MPE, and MAPE. ME and MPE would be judged by closeness to zero and their signs used to identify underforecasting or overforecasting; the other four measures would be minimised. Because MSE and RMSE induce the same ordering, they would not be treated as independent votes. Residual time plots, ACFs, and Ljung–Box tests at lag 24 would be evaluated with fitted degrees of freedom;</w:t>
       </w:r>
       <w:r>
         <w:t xml:space="preserve"> </w:t>
@@ -371,34 +312,15 @@
       <w:r>
         <w:t xml:space="preserve"> </w:t>
       </w:r>
-      <w:hyperlink w:anchor="ref-forecast-package">
-        <w:r>
-          <w:rPr>
-            <w:rStyle w:val="Hyperlink"/>
-          </w:rPr>
-          <w:t xml:space="preserve">[6]</w:t>
-        </w:r>
-      </w:hyperlink>
-      <w:r>
-        <w:t xml:space="preserve">,</w:t>
-      </w:r>
-      <w:r>
-        <w:t xml:space="preserve"> </w:t>
-      </w:r>
-      <w:hyperlink w:anchor="ref-r-core-2026">
-        <w:r>
-          <w:rPr>
-            <w:rStyle w:val="Hyperlink"/>
-          </w:rPr>
-          <w:t xml:space="preserve">[7]</w:t>
-        </w:r>
-      </w:hyperlink>
+      <w:r>
+        <w:t xml:space="preserve">[6], [7]</w:t>
+      </w:r>
       <w:r>
         <w:t xml:space="preserve">.</w:t>
       </w:r>
     </w:p>
     <w:bookmarkEnd w:id="23"/>
-    <w:bookmarkStart w:id="33" w:name="data-analysis"/>
+    <w:bookmarkStart w:id="30" w:name="data-analysis"/>
     <w:p>
       <w:pPr>
         <w:pStyle w:val="Heading1"/>
@@ -533,10 +455,13 @@
         <w:tblLook w:firstRow="1" w:lastRow="0" w:firstColumn="0" w:lastColumn="0" w:noHBand="0" w:noVBand="0" w:val="0020"/>
       </w:tblPr>
       <w:tblGrid>
-        <w:gridCol w:w="1821"/>
-        <w:gridCol w:w="3088"/>
-        <w:gridCol w:w="1504"/>
-        <w:gridCol w:w="1504"/>
+        <w:gridCol w:w="880"/>
+        <w:gridCol w:w="1173"/>
+        <w:gridCol w:w="1173"/>
+        <w:gridCol w:w="1173"/>
+        <w:gridCol w:w="1173"/>
+        <w:gridCol w:w="1173"/>
+        <w:gridCol w:w="1173"/>
       </w:tblGrid>
       <w:tr>
         <w:trPr>
@@ -558,9 +483,22 @@
           <w:p>
             <w:pPr>
               <w:pStyle w:val="Compact"/>
+              <w:jc w:val="right"/>
             </w:pPr>
             <w:r>
-              <w:t xml:space="preserve">Locked specification</w:t>
+              <w:t xml:space="preserve">ME</w:t>
+            </w:r>
+          </w:p>
+        </w:tc>
+        <w:tc>
+          <w:tcPr/>
+          <w:p>
+            <w:pPr>
+              <w:pStyle w:val="Compact"/>
+              <w:jc w:val="right"/>
+            </w:pPr>
+            <w:r>
+              <w:t xml:space="preserve">MSE</w:t>
             </w:r>
           </w:p>
         </w:tc>
@@ -588,6 +526,30 @@
             </w:r>
           </w:p>
         </w:tc>
+        <w:tc>
+          <w:tcPr/>
+          <w:p>
+            <w:pPr>
+              <w:pStyle w:val="Compact"/>
+              <w:jc w:val="right"/>
+            </w:pPr>
+            <w:r>
+              <w:t xml:space="preserve">MPE</w:t>
+            </w:r>
+          </w:p>
+        </w:tc>
+        <w:tc>
+          <w:tcPr/>
+          <w:p>
+            <w:pPr>
+              <w:pStyle w:val="Compact"/>
+              <w:jc w:val="right"/>
+            </w:pPr>
+            <w:r>
+              <w:t xml:space="preserve">MAPE</w:t>
+            </w:r>
+          </w:p>
+        </w:tc>
       </w:tr>
       <w:tr>
         <w:tc>
@@ -606,9 +568,10 @@
           <w:p>
             <w:pPr>
               <w:pStyle w:val="Compact"/>
+              <w:jc w:val="right"/>
             </w:pPr>
             <w:r>
-              <w:t xml:space="preserve">ARIMA(0,0,2)(2,1,1)[12]</w:t>
+              <w:t xml:space="preserve">−0.0566</w:t>
             </w:r>
           </w:p>
         </w:tc>
@@ -620,10 +583,18 @@
               <w:jc w:val="right"/>
             </w:pPr>
             <w:r>
-              <w:rPr>
-                <w:b/>
-                <w:bCs/>
-              </w:rPr>
+              <w:t xml:space="preserve">0.0857</w:t>
+            </w:r>
+          </w:p>
+        </w:tc>
+        <w:tc>
+          <w:tcPr/>
+          <w:p>
+            <w:pPr>
+              <w:pStyle w:val="Compact"/>
+              <w:jc w:val="right"/>
+            </w:pPr>
+            <w:r>
               <w:t xml:space="preserve">0.2928</w:t>
             </w:r>
           </w:p>
@@ -636,11 +607,31 @@
               <w:jc w:val="right"/>
             </w:pPr>
             <w:r>
-              <w:rPr>
-                <w:b/>
-                <w:bCs/>
-              </w:rPr>
               <w:t xml:space="preserve">0.2245</w:t>
+            </w:r>
+          </w:p>
+        </w:tc>
+        <w:tc>
+          <w:tcPr/>
+          <w:p>
+            <w:pPr>
+              <w:pStyle w:val="Compact"/>
+              <w:jc w:val="right"/>
+            </w:pPr>
+            <w:r>
+              <w:t xml:space="preserve">−1.4643%</w:t>
+            </w:r>
+          </w:p>
+        </w:tc>
+        <w:tc>
+          <w:tcPr/>
+          <w:p>
+            <w:pPr>
+              <w:pStyle w:val="Compact"/>
+              <w:jc w:val="right"/>
+            </w:pPr>
+            <w:r>
+              <w:t xml:space="preserve">4.7346%</w:t>
             </w:r>
           </w:p>
         </w:tc>
@@ -662,9 +653,22 @@
           <w:p>
             <w:pPr>
               <w:pStyle w:val="Compact"/>
+              <w:jc w:val="right"/>
             </w:pPr>
             <w:r>
-              <w:t xml:space="preserve">ETS(A,N,A)</w:t>
+              <w:t xml:space="preserve">−0.0847</w:t>
+            </w:r>
+          </w:p>
+        </w:tc>
+        <w:tc>
+          <w:tcPr/>
+          <w:p>
+            <w:pPr>
+              <w:pStyle w:val="Compact"/>
+              <w:jc w:val="right"/>
+            </w:pPr>
+            <w:r>
+              <w:t xml:space="preserve">0.0869</w:t>
             </w:r>
           </w:p>
         </w:tc>
@@ -692,6 +696,30 @@
             </w:r>
           </w:p>
         </w:tc>
+        <w:tc>
+          <w:tcPr/>
+          <w:p>
+            <w:pPr>
+              <w:pStyle w:val="Compact"/>
+              <w:jc w:val="right"/>
+            </w:pPr>
+            <w:r>
+              <w:t xml:space="preserve">−2.0546%</w:t>
+            </w:r>
+          </w:p>
+        </w:tc>
+        <w:tc>
+          <w:tcPr/>
+          <w:p>
+            <w:pPr>
+              <w:pStyle w:val="Compact"/>
+              <w:jc w:val="right"/>
+            </w:pPr>
+            <w:r>
+              <w:t xml:space="preserve">4.9673%</w:t>
+            </w:r>
+          </w:p>
+        </w:tc>
       </w:tr>
       <w:tr>
         <w:tc>
@@ -710,12 +738,22 @@
           <w:p>
             <w:pPr>
               <w:pStyle w:val="Compact"/>
+              <w:jc w:val="right"/>
             </w:pPr>
             <w:r>
-              <w:rPr>
-                <w:rStyle w:val="VerbatimChar"/>
-              </w:rPr>
-              <w:t xml:space="preserve">tslm(y ~ trend + season)</w:t>
+              <w:t xml:space="preserve">−0.0989</w:t>
+            </w:r>
+          </w:p>
+        </w:tc>
+        <w:tc>
+          <w:tcPr/>
+          <w:p>
+            <w:pPr>
+              <w:pStyle w:val="Compact"/>
+              <w:jc w:val="right"/>
+            </w:pPr>
+            <w:r>
+              <w:t xml:space="preserve">0.0893</w:t>
             </w:r>
           </w:p>
         </w:tc>
@@ -743,6 +781,30 @@
             </w:r>
           </w:p>
         </w:tc>
+        <w:tc>
+          <w:tcPr/>
+          <w:p>
+            <w:pPr>
+              <w:pStyle w:val="Compact"/>
+              <w:jc w:val="right"/>
+            </w:pPr>
+            <w:r>
+              <w:t xml:space="preserve">−2.3584%</w:t>
+            </w:r>
+          </w:p>
+        </w:tc>
+        <w:tc>
+          <w:tcPr/>
+          <w:p>
+            <w:pPr>
+              <w:pStyle w:val="Compact"/>
+              <w:jc w:val="right"/>
+            </w:pPr>
+            <w:r>
+              <w:t xml:space="preserve">5.1093%</w:t>
+            </w:r>
+          </w:p>
+        </w:tc>
       </w:tr>
       <w:tr>
         <w:tc>
@@ -761,9 +823,22 @@
           <w:p>
             <w:pPr>
               <w:pStyle w:val="Compact"/>
+              <w:jc w:val="right"/>
             </w:pPr>
             <w:r>
-              <w:t xml:space="preserve">Additive; no trend</w:t>
+              <w:t xml:space="preserve">−0.1037</w:t>
+            </w:r>
+          </w:p>
+        </w:tc>
+        <w:tc>
+          <w:tcPr/>
+          <w:p>
+            <w:pPr>
+              <w:pStyle w:val="Compact"/>
+              <w:jc w:val="right"/>
+            </w:pPr>
+            <w:r>
+              <w:t xml:space="preserve">0.0962</w:t>
             </w:r>
           </w:p>
         </w:tc>
@@ -791,35 +866,15 @@
             </w:r>
           </w:p>
         </w:tc>
-      </w:tr>
-    </w:tbl>
-    <w:p/>
-    <w:tbl>
-      <w:tblPr>
-        <w:tblStyle w:val="Table"/>
-        <w:tblW w:type="pct" w:w="5000"/>
-        <w:tblLayout w:type="fixed"/>
-        <w:tblLook w:firstRow="1" w:lastRow="0" w:firstColumn="0" w:lastColumn="0" w:noHBand="0" w:noVBand="0" w:val="0020"/>
-      </w:tblPr>
-      <w:tblGrid>
-        <w:gridCol w:w="1742"/>
-        <w:gridCol w:w="1544"/>
-        <w:gridCol w:w="1544"/>
-        <w:gridCol w:w="1544"/>
-        <w:gridCol w:w="1544"/>
-      </w:tblGrid>
-      <w:tr>
-        <w:trPr>
-          <w:tblHeader w:val="on"/>
-        </w:trPr>
         <w:tc>
           <w:tcPr/>
           <w:p>
             <w:pPr>
               <w:pStyle w:val="Compact"/>
+              <w:jc w:val="right"/>
             </w:pPr>
             <w:r>
-              <w:t xml:space="preserve">Model</w:t>
+              <w:t xml:space="preserve">−2.4553%</w:t>
             </w:r>
           </w:p>
         </w:tc>
@@ -831,303 +886,7 @@
               <w:jc w:val="right"/>
             </w:pPr>
             <w:r>
-              <w:t xml:space="preserve">MAPE (%)</w:t>
-            </w:r>
-          </w:p>
-        </w:tc>
-        <w:tc>
-          <w:tcPr/>
-          <w:p>
-            <w:pPr>
-              <w:pStyle w:val="Compact"/>
-              <w:jc w:val="right"/>
-            </w:pPr>
-            <w:r>
-              <w:t xml:space="preserve">MASE</w:t>
-            </w:r>
-          </w:p>
-        </w:tc>
-        <w:tc>
-          <w:tcPr/>
-          <w:p>
-            <w:pPr>
-              <w:pStyle w:val="Compact"/>
-              <w:jc w:val="right"/>
-            </w:pPr>
-            <w:r>
-              <w:t xml:space="preserve">sMAPE (%)</w:t>
-            </w:r>
-          </w:p>
-        </w:tc>
-        <w:tc>
-          <w:tcPr/>
-          <w:p>
-            <w:pPr>
-              <w:pStyle w:val="Compact"/>
-              <w:jc w:val="right"/>
-            </w:pPr>
-            <w:r>
-              <w:t xml:space="preserve">Ljung–Box p</w:t>
-            </w:r>
-          </w:p>
-        </w:tc>
-      </w:tr>
-      <w:tr>
-        <w:tc>
-          <w:tcPr/>
-          <w:p>
-            <w:pPr>
-              <w:pStyle w:val="Compact"/>
-            </w:pPr>
-            <w:r>
-              <w:t xml:space="preserve">SARIMA</w:t>
-            </w:r>
-          </w:p>
-        </w:tc>
-        <w:tc>
-          <w:tcPr/>
-          <w:p>
-            <w:pPr>
-              <w:pStyle w:val="Compact"/>
-              <w:jc w:val="right"/>
-            </w:pPr>
-            <w:r>
-              <w:rPr>
-                <w:b/>
-                <w:bCs/>
-              </w:rPr>
-              <w:t xml:space="preserve">4.7346</w:t>
-            </w:r>
-          </w:p>
-        </w:tc>
-        <w:tc>
-          <w:tcPr/>
-          <w:p>
-            <w:pPr>
-              <w:pStyle w:val="Compact"/>
-              <w:jc w:val="right"/>
-            </w:pPr>
-            <w:r>
-              <w:rPr>
-                <w:b/>
-                <w:bCs/>
-              </w:rPr>
-              <w:t xml:space="preserve">0.7563</w:t>
-            </w:r>
-          </w:p>
-        </w:tc>
-        <w:tc>
-          <w:tcPr/>
-          <w:p>
-            <w:pPr>
-              <w:pStyle w:val="Compact"/>
-              <w:jc w:val="right"/>
-            </w:pPr>
-            <w:r>
-              <w:rPr>
-                <w:b/>
-                <w:bCs/>
-              </w:rPr>
-              <w:t xml:space="preserve">4.6872</w:t>
-            </w:r>
-          </w:p>
-        </w:tc>
-        <w:tc>
-          <w:tcPr/>
-          <w:p>
-            <w:pPr>
-              <w:pStyle w:val="Compact"/>
-              <w:jc w:val="right"/>
-            </w:pPr>
-            <w:r>
-              <w:t xml:space="preserve">0.2129</w:t>
-            </w:r>
-          </w:p>
-        </w:tc>
-      </w:tr>
-      <w:tr>
-        <w:tc>
-          <w:tcPr/>
-          <w:p>
-            <w:pPr>
-              <w:pStyle w:val="Compact"/>
-            </w:pPr>
-            <w:r>
-              <w:t xml:space="preserve">ETS</w:t>
-            </w:r>
-          </w:p>
-        </w:tc>
-        <w:tc>
-          <w:tcPr/>
-          <w:p>
-            <w:pPr>
-              <w:pStyle w:val="Compact"/>
-              <w:jc w:val="right"/>
-            </w:pPr>
-            <w:r>
-              <w:t xml:space="preserve">4.9673</w:t>
-            </w:r>
-          </w:p>
-        </w:tc>
-        <w:tc>
-          <w:tcPr/>
-          <w:p>
-            <w:pPr>
-              <w:pStyle w:val="Compact"/>
-              <w:jc w:val="right"/>
-            </w:pPr>
-            <w:r>
-              <w:t xml:space="preserve">0.7920</w:t>
-            </w:r>
-          </w:p>
-        </w:tc>
-        <w:tc>
-          <w:tcPr/>
-          <w:p>
-            <w:pPr>
-              <w:pStyle w:val="Compact"/>
-              <w:jc w:val="right"/>
-            </w:pPr>
-            <w:r>
-              <w:t xml:space="preserve">4.8996</w:t>
-            </w:r>
-          </w:p>
-        </w:tc>
-        <w:tc>
-          <w:tcPr/>
-          <w:p>
-            <w:pPr>
-              <w:pStyle w:val="Compact"/>
-              <w:jc w:val="right"/>
-            </w:pPr>
-            <w:r>
-              <w:t xml:space="preserve">0.0720</w:t>
-            </w:r>
-          </w:p>
-        </w:tc>
-      </w:tr>
-      <w:tr>
-        <w:tc>
-          <w:tcPr/>
-          <w:p>
-            <w:pPr>
-              <w:pStyle w:val="Compact"/>
-            </w:pPr>
-            <w:r>
-              <w:t xml:space="preserve">Trend + season</w:t>
-            </w:r>
-          </w:p>
-        </w:tc>
-        <w:tc>
-          <w:tcPr/>
-          <w:p>
-            <w:pPr>
-              <w:pStyle w:val="Compact"/>
-              <w:jc w:val="right"/>
-            </w:pPr>
-            <w:r>
-              <w:t xml:space="preserve">5.1093</w:t>
-            </w:r>
-          </w:p>
-        </w:tc>
-        <w:tc>
-          <w:tcPr/>
-          <w:p>
-            <w:pPr>
-              <w:pStyle w:val="Compact"/>
-              <w:jc w:val="right"/>
-            </w:pPr>
-            <w:r>
-              <w:t xml:space="preserve">0.8130</w:t>
-            </w:r>
-          </w:p>
-        </w:tc>
-        <w:tc>
-          <w:tcPr/>
-          <w:p>
-            <w:pPr>
-              <w:pStyle w:val="Compact"/>
-              <w:jc w:val="right"/>
-            </w:pPr>
-            <w:r>
-              <w:t xml:space="preserve">5.0270</w:t>
-            </w:r>
-          </w:p>
-        </w:tc>
-        <w:tc>
-          <w:tcPr/>
-          <w:p>
-            <w:pPr>
-              <w:pStyle w:val="Compact"/>
-              <w:jc w:val="right"/>
-            </w:pPr>
-            <w:r>
-              <w:rPr>
-                <w:b/>
-                <w:bCs/>
-              </w:rPr>
-              <w:t xml:space="preserve">0.0006</w:t>
-            </w:r>
-          </w:p>
-        </w:tc>
-      </w:tr>
-      <w:tr>
-        <w:tc>
-          <w:tcPr/>
-          <w:p>
-            <w:pPr>
-              <w:pStyle w:val="Compact"/>
-            </w:pPr>
-            <w:r>
-              <w:t xml:space="preserve">Holt–Winters</w:t>
-            </w:r>
-          </w:p>
-        </w:tc>
-        <w:tc>
-          <w:tcPr/>
-          <w:p>
-            <w:pPr>
-              <w:pStyle w:val="Compact"/>
-              <w:jc w:val="right"/>
-            </w:pPr>
-            <w:r>
-              <w:t xml:space="preserve">5.2213</w:t>
-            </w:r>
-          </w:p>
-        </w:tc>
-        <w:tc>
-          <w:tcPr/>
-          <w:p>
-            <w:pPr>
-              <w:pStyle w:val="Compact"/>
-              <w:jc w:val="right"/>
-            </w:pPr>
-            <w:r>
-              <w:t xml:space="preserve">0.8300</w:t>
-            </w:r>
-          </w:p>
-        </w:tc>
-        <w:tc>
-          <w:tcPr/>
-          <w:p>
-            <w:pPr>
-              <w:pStyle w:val="Compact"/>
-              <w:jc w:val="right"/>
-            </w:pPr>
-            <w:r>
-              <w:t xml:space="preserve">5.1149</w:t>
-            </w:r>
-          </w:p>
-        </w:tc>
-        <w:tc>
-          <w:tcPr/>
-          <w:p>
-            <w:pPr>
-              <w:pStyle w:val="Compact"/>
-              <w:jc w:val="right"/>
-            </w:pPr>
-            <w:r>
-              <w:t xml:space="preserve">0.1491</w:t>
+              <w:t xml:space="preserve">5.2213%</w:t>
             </w:r>
           </w:p>
         </w:tc>
@@ -1135,57 +894,33 @@
     </w:tbl>
     <w:p>
       <w:pPr>
-        <w:pStyle w:val="CaptionedFigure"/>
-      </w:pPr>
-      <w:r>
-        <w:drawing>
-          <wp:inline>
-            <wp:extent cx="2926080" cy="1625600"/>
-            <wp:effectExtent b="0" l="0" r="0" t="0"/>
-            <wp:docPr descr="Observed values and four forecasts on the common January 2021–December 2025 test period." title="" id="31" name="Picture"/>
-            <a:graphic>
-              <a:graphicData uri="http://schemas.openxmlformats.org/drawingml/2006/picture">
-                <pic:pic>
-                  <pic:nvPicPr>
-                    <pic:cNvPr descr="../analysis_outputs/nasa/figures/nasa_test_forecasts.png" id="32" name="Picture"/>
-                    <pic:cNvPicPr>
-                      <a:picLocks noChangeArrowheads="1" noChangeAspect="1"/>
-                    </pic:cNvPicPr>
-                  </pic:nvPicPr>
-                  <pic:blipFill>
-                    <a:blip r:embed="rId30"/>
-                    <a:stretch>
-                      <a:fillRect/>
-                    </a:stretch>
-                  </pic:blipFill>
-                  <pic:spPr bwMode="auto">
-                    <a:xfrm>
-                      <a:off x="0" y="0"/>
-                      <a:ext cx="2926080" cy="1625600"/>
-                    </a:xfrm>
-                    <a:prstGeom prst="rect">
-                      <a:avLst/>
-                    </a:prstGeom>
-                    <a:noFill/>
-                    <a:ln w="9525">
-                      <a:noFill/>
-                      <a:headEnd/>
-                      <a:tailEnd/>
-                    </a:ln>
-                  </pic:spPr>
-                </pic:pic>
-              </a:graphicData>
-            </a:graphic>
-          </wp:inline>
-        </w:drawing>
+        <w:pStyle w:val="BodyText"/>
+      </w:pPr>
+      <w:r>
+        <w:t xml:space="preserve">On the common test period, SARIMA had the lowest MSE, RMSE, MAE, and MAPE and the ME and MPE closest to zero. Negative ME and MPE for every model indicate average overforecasting under the declared</w:t>
+      </w:r>
+      <w:r>
+        <w:t xml:space="preserve"> </w:t>
+      </w:r>
+      <w:r>
+        <w:rPr>
+          <w:rStyle w:val="VerbatimChar"/>
+        </w:rPr>
+        <w:t xml:space="preserve">actual − forecast</w:t>
+      </w:r>
+      <w:r>
+        <w:t xml:space="preserve"> </w:t>
+      </w:r>
+      <w:r>
+        <w:t xml:space="preserve">convention. Residual checks were also considered when determining whether a model was admissible.</w:t>
       </w:r>
     </w:p>
     <w:p>
       <w:pPr>
-        <w:pStyle w:val="ImageCaption"/>
-      </w:pPr>
-      <w:r>
-        <w:t xml:space="preserve">Observed values and four forecasts on the common January 2021–December 2025 test period.</w:t>
+        <w:pStyle w:val="BodyText"/>
+      </w:pPr>
+      <w:r>
+        <w:t xml:space="preserve">ARIMA ranked first and passed the diagnostic and physical-plausibility gates. Its RMSE was only 0.0019 kWh/m²/day (0.65%) below ETS, so the predictive advantage is modest rather than decisive. ETS was a statistically acceptable close second. Holt–Winters also passed its white-noise test but produced the largest errors. Linear regression ranked third by RMSE but failed the residual eligibility condition because material serial dependence remained.</w:t>
       </w:r>
     </w:p>
     <w:p>
@@ -1193,33 +928,25 @@
         <w:pStyle w:val="BodyText"/>
       </w:pPr>
       <w:r>
-        <w:t xml:space="preserve">SARIMA ranked first and passed the diagnostic and physical-plausibility gates. Its RMSE was only 0.0019 kWh/m²/day (0.65%) below ETS, so the predictive advantage is modest rather than decisive. ETS was a statistically acceptable close second. Holt–Winters also passed its white-noise test but produced the largest errors, suggesting that slowly adapting level and seasonal components were too restrictive. Regression ranked third by RMSE but failed the residual eligibility condition; its fixed month indicators and linear trend left material serial dependence.</w:t>
+        <w:t xml:space="preserve">The selected ARIMA model represents recurring annual patterns and serial dependence in the irradiance series. After selection, it was refitted using the complete dataset to produce the 2026 forecasts. These future forecasts were not used in the 2021–2025 model comparison.</w:t>
+      </w:r>
+    </w:p>
+    <w:bookmarkEnd w:id="30"/>
+    <w:bookmarkStart w:id="46" w:name="conclusion"/>
+    <w:p>
+      <w:pPr>
+        <w:pStyle w:val="Heading1"/>
+      </w:pPr>
+      <w:r>
+        <w:t xml:space="preserve">Conclusion</w:t>
       </w:r>
     </w:p>
     <w:p>
       <w:pPr>
-        <w:pStyle w:val="BodyText"/>
-      </w:pPr>
-      <w:r>
-        <w:t xml:space="preserve">The selected SARIMA contains one annual difference, two ordinary moving-average terms, two seasonal autoregressive terms, and one seasonal moving-average term. This structure directly represents recurring annual change and serial dependence. Re-estimating the locked order on all 300 observations produced MA(1)=0.2126, MA(2)=0.1008, seasonal AR(1)=−0.0013, seasonal AR(2)=−0.0774, and seasonal MA(1)=−0.9343. The 2026 point forecasts range from 4.2238 in December to 5.2472 in March; all 95% lower limits remain positive. These are future forecasts and were not used in the 2021–2025 comparison.</w:t>
-      </w:r>
-    </w:p>
-    <w:bookmarkEnd w:id="33"/>
-    <w:bookmarkStart w:id="49" w:name="conclusion"/>
-    <w:p>
-      <w:pPr>
-        <w:pStyle w:val="Heading1"/>
-      </w:pPr>
-      <w:r>
-        <w:t xml:space="preserve">Conclusion</w:t>
-      </w:r>
-    </w:p>
-    <w:p>
-      <w:pPr>
         <w:pStyle w:val="FirstParagraph"/>
       </w:pPr>
       <w:r>
-        <w:t xml:space="preserve">SARIMA provided the strongest admissible result for this dataset: RMSE 0.2928, MAE 0.2245, and Ljung–Box</w:t>
+        <w:t xml:space="preserve">ARIMA provided the strongest admissible result for this dataset: RMSE 0.2928, MAE 0.2245, and Ljung–Box</w:t>
       </w:r>
       <w:r>
         <w:t xml:space="preserve"> </w:t>
@@ -1239,7 +966,7 @@
         </m:r>
       </m:oMath>
       <w:r>
-        <w:t xml:space="preserve">. Its narrow advantage over ETS shows that the conclusion should be treated as a defensible selection for the present sample, not evidence of universal superiority. The pattern supports annual seasonality and short/seasonal dependence, while the uncertain regression trend cautions against asserting strong long-run growth.</w:t>
+        <w:t xml:space="preserve">. Its narrow advantage over ETS shows that the conclusion should be treated as a defensible selection for the present sample, not evidence of universal superiority. The pattern supports annual seasonality and serial dependence, while the uncertain regression trend cautions against asserting strong long-run growth.</w:t>
       </w:r>
     </w:p>
     <w:p>
@@ -1247,7 +974,7 @@
         <w:pStyle w:val="BodyText"/>
       </w:pPr>
       <w:r>
-        <w:t xml:space="preserve">Seasonal irradiance forecasts can inform early-stage renewable-resource assessment, maintenance timing, and storage planning aligned with SDG 7.2, but engineering decisions additionally require panel efficiency, temperature, shading, system losses, demand, and cost data. Further limitations include the gridded satellite product, monthly averaging, source-archive changes, absence of ground-station validation, structural-change risk, and uncertainty over the five-year horizon. Recommended extensions are local validation, rolling-origin model selection, a Box–Cox sensitivity analysis, higher-frequency weather predictors, regression with ARIMA errors, forecast combinations, and scheduled re-estimation as new observations arrive.</w:t>
+        <w:t xml:space="preserve">Seasonal irradiance forecasts can inform early-stage renewable-resource assessment, maintenance timing, and storage planning aligned with SDG 7.2, but engineering decisions additionally require panel efficiency, temperature, shading, system losses, demand, and cost data. Further limitations include the gridded satellite product, monthly averaging, source-archive changes, absence of ground-station validation, structural-change risk, and uncertainty over the five-year horizon. Recommended extensions are local validation, rolling-origin evaluation, additional weather predictors, forecast combinations, and scheduled re-estimation as new observations arrive.</w:t>
       </w:r>
     </w:p>
     <w:p>
@@ -1258,253 +985,60 @@
         <w:t xml:space="preserve">Author Contributions</w:t>
       </w:r>
     </w:p>
-    <w:tbl>
-      <w:tblPr>
-        <w:tblStyle w:val="Table"/>
-        <w:tblW w:type="pct" w:w="5000"/>
-        <w:tblLayout w:type="fixed"/>
-        <w:tblLook w:firstRow="1" w:lastRow="0" w:firstColumn="0" w:lastColumn="0" w:noHBand="0" w:noVBand="0" w:val="0020"/>
-      </w:tblPr>
-      <w:tblGrid>
-        <w:gridCol w:w="3801"/>
-        <w:gridCol w:w="1900"/>
-        <w:gridCol w:w="2217"/>
-      </w:tblGrid>
-      <w:tr>
-        <w:trPr>
-          <w:tblHeader w:val="on"/>
-        </w:trPr>
-        <w:tc>
-          <w:tcPr/>
-          <w:p>
-            <w:pPr>
-              <w:pStyle w:val="Compact"/>
-            </w:pPr>
-            <w:r>
-              <w:t xml:space="preserve">Member</w:t>
-            </w:r>
-          </w:p>
-        </w:tc>
-        <w:tc>
-          <w:tcPr/>
-          <w:p>
-            <w:pPr>
-              <w:pStyle w:val="Compact"/>
-            </w:pPr>
-            <w:r>
-              <w:t xml:space="preserve">Student ID</w:t>
-            </w:r>
-          </w:p>
-        </w:tc>
-        <w:tc>
-          <w:tcPr/>
-          <w:p>
-            <w:pPr>
-              <w:pStyle w:val="Compact"/>
-              <w:jc w:val="right"/>
-            </w:pPr>
-            <w:r>
-              <w:t xml:space="preserve">Contribution</w:t>
-            </w:r>
-          </w:p>
-        </w:tc>
-      </w:tr>
-      <w:tr>
-        <w:tc>
-          <w:tcPr/>
-          <w:p>
-            <w:pPr>
-              <w:pStyle w:val="Compact"/>
-            </w:pPr>
-            <w:r>
-              <w:t xml:space="preserve">[Member 1 name]</w:t>
-            </w:r>
-          </w:p>
-        </w:tc>
-        <w:tc>
-          <w:tcPr/>
-          <w:p>
-            <w:pPr>
-              <w:pStyle w:val="Compact"/>
-            </w:pPr>
-            <w:r>
-              <w:t xml:space="preserve">[ID]</w:t>
-            </w:r>
-          </w:p>
-        </w:tc>
-        <w:tc>
-          <w:tcPr/>
-          <w:p>
-            <w:pPr>
-              <w:pStyle w:val="Compact"/>
-              <w:jc w:val="right"/>
-            </w:pPr>
-            <w:r>
-              <w:t xml:space="preserve">[25%]</w:t>
-            </w:r>
-          </w:p>
-        </w:tc>
-      </w:tr>
-      <w:tr>
-        <w:tc>
-          <w:tcPr/>
-          <w:p>
-            <w:pPr>
-              <w:pStyle w:val="Compact"/>
-            </w:pPr>
-            <w:r>
-              <w:t xml:space="preserve">[Member 2 name]</w:t>
-            </w:r>
-          </w:p>
-        </w:tc>
-        <w:tc>
-          <w:tcPr/>
-          <w:p>
-            <w:pPr>
-              <w:pStyle w:val="Compact"/>
-            </w:pPr>
-            <w:r>
-              <w:t xml:space="preserve">[ID]</w:t>
-            </w:r>
-          </w:p>
-        </w:tc>
-        <w:tc>
-          <w:tcPr/>
-          <w:p>
-            <w:pPr>
-              <w:pStyle w:val="Compact"/>
-              <w:jc w:val="right"/>
-            </w:pPr>
-            <w:r>
-              <w:t xml:space="preserve">[25%]</w:t>
-            </w:r>
-          </w:p>
-        </w:tc>
-      </w:tr>
-      <w:tr>
-        <w:tc>
-          <w:tcPr/>
-          <w:p>
-            <w:pPr>
-              <w:pStyle w:val="Compact"/>
-            </w:pPr>
-            <w:r>
-              <w:t xml:space="preserve">[Member 3 name]</w:t>
-            </w:r>
-          </w:p>
-        </w:tc>
-        <w:tc>
-          <w:tcPr/>
-          <w:p>
-            <w:pPr>
-              <w:pStyle w:val="Compact"/>
-            </w:pPr>
-            <w:r>
-              <w:t xml:space="preserve">[ID]</w:t>
-            </w:r>
-          </w:p>
-        </w:tc>
-        <w:tc>
-          <w:tcPr/>
-          <w:p>
-            <w:pPr>
-              <w:pStyle w:val="Compact"/>
-              <w:jc w:val="right"/>
-            </w:pPr>
-            <w:r>
-              <w:t xml:space="preserve">[25%]</w:t>
-            </w:r>
-          </w:p>
-        </w:tc>
-      </w:tr>
-      <w:tr>
-        <w:tc>
-          <w:tcPr/>
-          <w:p>
-            <w:pPr>
-              <w:pStyle w:val="Compact"/>
-            </w:pPr>
-            <w:r>
-              <w:t xml:space="preserve">[Member 4 name]</w:t>
-            </w:r>
-          </w:p>
-        </w:tc>
-        <w:tc>
-          <w:tcPr/>
-          <w:p>
-            <w:pPr>
-              <w:pStyle w:val="Compact"/>
-            </w:pPr>
-            <w:r>
-              <w:t xml:space="preserve">[ID]</w:t>
-            </w:r>
-          </w:p>
-        </w:tc>
-        <w:tc>
-          <w:tcPr/>
-          <w:p>
-            <w:pPr>
-              <w:pStyle w:val="Compact"/>
-              <w:jc w:val="right"/>
-            </w:pPr>
-            <w:r>
-              <w:t xml:space="preserve">[25%]</w:t>
-            </w:r>
-          </w:p>
-        </w:tc>
-      </w:tr>
-      <w:tr>
-        <w:tc>
-          <w:tcPr/>
-          <w:p>
-            <w:pPr>
-              <w:pStyle w:val="Compact"/>
-            </w:pPr>
-            <w:r>
-              <w:rPr>
-                <w:b/>
-                <w:bCs/>
-              </w:rPr>
-              <w:t xml:space="preserve">Total</w:t>
-            </w:r>
-          </w:p>
-        </w:tc>
-        <w:tc>
-          <w:tcPr/>
-          <w:p>
-            <w:pPr>
-              <w:pStyle w:val="Compact"/>
-            </w:pPr>
-          </w:p>
-        </w:tc>
-        <w:tc>
-          <w:tcPr/>
-          <w:p>
-            <w:pPr>
-              <w:pStyle w:val="Compact"/>
-              <w:jc w:val="right"/>
-            </w:pPr>
-            <w:r>
-              <w:rPr>
-                <w:b/>
-                <w:bCs/>
-              </w:rPr>
-              <w:t xml:space="preserve">100%</w:t>
-            </w:r>
-          </w:p>
-        </w:tc>
-      </w:tr>
-    </w:tbl>
     <w:p>
       <w:pPr>
+        <w:pStyle w:val="BodyText"/>
+      </w:pPr>
+      <w:r>
+        <w:t xml:space="preserve">[Member 1 name] ([ID]): [25%]</w:t>
+      </w:r>
+    </w:p>
+    <w:p>
+      <w:pPr>
+        <w:pStyle w:val="BodyText"/>
+      </w:pPr>
+      <w:r>
+        <w:t xml:space="preserve">[Member 2 name] ([ID]): [25%]</w:t>
+      </w:r>
+    </w:p>
+    <w:p>
+      <w:pPr>
+        <w:pStyle w:val="BodyText"/>
+      </w:pPr>
+      <w:r>
+        <w:t xml:space="preserve">[Member 3 name] ([ID]): [25%]</w:t>
+      </w:r>
+    </w:p>
+    <w:p>
+      <w:pPr>
+        <w:pStyle w:val="BodyText"/>
+      </w:pPr>
+      <w:r>
+        <w:t xml:space="preserve">[Member 4 name] ([ID]): [25%]</w:t>
+      </w:r>
+    </w:p>
+    <w:p>
+      <w:pPr>
+        <w:pStyle w:val="BodyText"/>
+      </w:pPr>
+      <w:r>
+        <w:rPr>
+          <w:b/>
+          <w:bCs/>
+        </w:rPr>
+        <w:t xml:space="preserve">Total: 100%</w:t>
+      </w:r>
+    </w:p>
+    <w:p>
+      <w:pPr>
         <w:pStyle w:val="Heading5"/>
       </w:pPr>
       <w:r>
         <w:t xml:space="preserve">References</w:t>
       </w:r>
     </w:p>
-    <w:bookmarkStart w:id="48" w:name="refs"/>
-    <w:bookmarkStart w:id="35" w:name="ref-nasa-power-monthly"/>
+    <w:bookmarkStart w:id="45" w:name="refs"/>
+    <w:bookmarkStart w:id="32" w:name="ref-nasa-power-monthly"/>
     <w:p>
       <w:pPr>
         <w:pStyle w:val="Bibliography"/>
@@ -1533,7 +1067,7 @@
       <w:r>
         <w:t xml:space="preserve"> </w:t>
       </w:r>
-      <w:hyperlink r:id="rId34">
+      <w:hyperlink r:id="rId31">
         <w:r>
           <w:rPr>
             <w:rStyle w:val="Hyperlink"/>
@@ -1542,8 +1076,8 @@
         </w:r>
       </w:hyperlink>
     </w:p>
-    <w:bookmarkEnd w:id="35"/>
-    <w:bookmarkStart w:id="37" w:name="ref-un-sdg7"/>
+    <w:bookmarkEnd w:id="32"/>
+    <w:bookmarkStart w:id="34" w:name="ref-un-sdg7"/>
     <w:p>
       <w:pPr>
         <w:pStyle w:val="Bibliography"/>
@@ -1572,7 +1106,7 @@
       <w:r>
         <w:t xml:space="preserve"> </w:t>
       </w:r>
-      <w:hyperlink r:id="rId36">
+      <w:hyperlink r:id="rId33">
         <w:r>
           <w:rPr>
             <w:rStyle w:val="Hyperlink"/>
@@ -1581,8 +1115,8 @@
         </w:r>
       </w:hyperlink>
     </w:p>
-    <w:bookmarkEnd w:id="37"/>
-    <w:bookmarkStart w:id="39" w:name="ref-hyndman-athanasopoulos-2021"/>
+    <w:bookmarkEnd w:id="34"/>
+    <w:bookmarkStart w:id="36" w:name="ref-hyndman-athanasopoulos-2021"/>
     <w:p>
       <w:pPr>
         <w:pStyle w:val="Bibliography"/>
@@ -1615,7 +1149,7 @@
       <w:r>
         <w:t xml:space="preserve"> </w:t>
       </w:r>
-      <w:hyperlink r:id="rId38">
+      <w:hyperlink r:id="rId35">
         <w:r>
           <w:rPr>
             <w:rStyle w:val="Hyperlink"/>
@@ -1624,8 +1158,8 @@
         </w:r>
       </w:hyperlink>
     </w:p>
-    <w:bookmarkEnd w:id="39"/>
-    <w:bookmarkStart w:id="41" w:name="ref-hyndman-khandakar-2008"/>
+    <w:bookmarkEnd w:id="36"/>
+    <w:bookmarkStart w:id="38" w:name="ref-hyndman-khandakar-2008"/>
     <w:p>
       <w:pPr>
         <w:pStyle w:val="Bibliography"/>
@@ -1667,7 +1201,7 @@
       <w:r>
         <w:t xml:space="preserve"> </w:t>
       </w:r>
-      <w:hyperlink r:id="rId40">
+      <w:hyperlink r:id="rId37">
         <w:r>
           <w:rPr>
             <w:rStyle w:val="Hyperlink"/>
@@ -1679,8 +1213,8 @@
         <w:t xml:space="preserve">.</w:t>
       </w:r>
     </w:p>
-    <w:bookmarkEnd w:id="41"/>
-    <w:bookmarkStart w:id="43" w:name="ref-forecast-residuals"/>
+    <w:bookmarkEnd w:id="38"/>
+    <w:bookmarkStart w:id="40" w:name="ref-forecast-residuals"/>
     <w:p>
       <w:pPr>
         <w:pStyle w:val="Bibliography"/>
@@ -1709,7 +1243,7 @@
       <w:r>
         <w:t xml:space="preserve"> </w:t>
       </w:r>
-      <w:hyperlink r:id="rId42">
+      <w:hyperlink r:id="rId39">
         <w:r>
           <w:rPr>
             <w:rStyle w:val="Hyperlink"/>
@@ -1718,8 +1252,8 @@
         </w:r>
       </w:hyperlink>
     </w:p>
-    <w:bookmarkEnd w:id="43"/>
-    <w:bookmarkStart w:id="45" w:name="ref-forecast-package"/>
+    <w:bookmarkEnd w:id="40"/>
+    <w:bookmarkStart w:id="42" w:name="ref-forecast-package"/>
     <w:p>
       <w:pPr>
         <w:pStyle w:val="Bibliography"/>
@@ -1765,7 +1299,7 @@
       <w:r>
         <w:t xml:space="preserve"> </w:t>
       </w:r>
-      <w:hyperlink r:id="rId44">
+      <w:hyperlink r:id="rId41">
         <w:r>
           <w:rPr>
             <w:rStyle w:val="Hyperlink"/>
@@ -1774,8 +1308,8 @@
         </w:r>
       </w:hyperlink>
     </w:p>
-    <w:bookmarkEnd w:id="45"/>
-    <w:bookmarkStart w:id="47" w:name="ref-r-core-2026"/>
+    <w:bookmarkEnd w:id="42"/>
+    <w:bookmarkStart w:id="44" w:name="ref-r-core-2026"/>
     <w:p>
       <w:pPr>
         <w:pStyle w:val="Bibliography"/>
@@ -1808,7 +1342,7 @@
       <w:r>
         <w:t xml:space="preserve"> </w:t>
       </w:r>
-      <w:hyperlink r:id="rId46">
+      <w:hyperlink r:id="rId43">
         <w:r>
           <w:rPr>
             <w:rStyle w:val="Hyperlink"/>
@@ -1817,9 +1351,9 @@
         </w:r>
       </w:hyperlink>
     </w:p>
-    <w:bookmarkEnd w:id="47"/>
-    <w:bookmarkEnd w:id="48"/>
-    <w:bookmarkEnd w:id="49"/>
+    <w:bookmarkEnd w:id="44"/>
+    <w:bookmarkEnd w:id="45"/>
+    <w:bookmarkEnd w:id="46"/>
     <w:sectPr>
       <w:headerReference r:id="rId8" w:type="even"/>
       <w:headerReference r:id="rId9" w:type="default"/>

</xml_diff>

<commit_message>
Revise solar forecasting analysis and reports
</commit_message>
<xml_diff>
--- a/Assignment Report/Group_Report.docx
+++ b/Assignment Report/Group_Report.docx
@@ -61,7 +61,7 @@
         <w:t xml:space="preserve">Abstract—</w:t>
       </w:r>
       <w:r>
-        <w:t xml:space="preserve">This study compares ARIMA, Holt–Winters, ETS, and linear regression for forecasting monthly NASA POWER surface solar irradiance in Kuala Lumpur. Models are evaluated on a common January 2021–December 2025 test period using accuracy, residual diagnostics, and physical-plausibility checks. ARIMA achieved the strongest admissible result, although its advantage over ETS was modest.</w:t>
+        <w:t xml:space="preserve">This study compares SARIMA, Holt–Winters, ETS, and a basic structural time-series model for forecasting monthly NASA POWER surface solar irradiance in Kuala Lumpur. Models are evaluated on a common January 2021–December 2025 test period using accuracy, residual diagnostics, and physical-plausibility checks. SARIMA achieved the strongest admissible result, although its advantage over ETS and the structural model was modest.</w:t>
       </w:r>
     </w:p>
     <w:p>
@@ -76,7 +76,7 @@
         <w:t xml:space="preserve">Keywords—</w:t>
       </w:r>
       <w:r>
-        <w:t xml:space="preserve">ARIMA, ETS, forecasting, Holt–Winters, linear regression, NASA POWER, solar irradiance.</w:t>
+        <w:t xml:space="preserve">basic structural model, ETS, forecasting, Holt–Winters, NASA POWER, SARIMA, solar irradiance.</w:t>
       </w:r>
     </w:p>
     <w:bookmarkStart w:id="22" w:name="introduction"/>
@@ -125,7 +125,7 @@
         <w:pStyle w:val="BodyText"/>
       </w:pPr>
       <w:r>
-        <w:t xml:space="preserve">The objectives were to (1) audit and describe the monthly series; (2) fit and diagnose ARIMA, Holt–Winters, ETS, and linear regression models; (3) compare the fitted models on a common 60-month chronological test using ME, MSE, RMSE, MAE, MPE, and MAPE; and (4) interpret the selected model for solar-resource planning. The work supports United Nations Sustainable Development Goal 7,</w:t>
+        <w:t xml:space="preserve">The objectives were to (1) audit and describe the monthly series; (2) fit and diagnose SARIMA, Holt–Winters, ETS, and a basic structural model; (3) compare the fitted models on a common 60-month chronological test using ME, MSE, RMSE, MAE, MPE, and MAPE; and (4) interpret the selected model for solar-resource planning. The work supports United Nations Sustainable Development Goal 7,</w:t>
       </w:r>
       <w:r>
         <w:t xml:space="preserve"> </w:t>
@@ -165,7 +165,7 @@
         <w:pStyle w:val="FirstParagraph"/>
       </w:pPr>
       <w:r>
-        <w:t xml:space="preserve">The NASA JSON response was to be parsed by year-month. Annual-summary keys such as</w:t>
+        <w:t xml:space="preserve">The NASA JSON response would be parsed by year-month. Annual-summary keys such as</w:t>
       </w:r>
       <w:r>
         <w:t xml:space="preserve"> </w:t>
@@ -203,7 +203,7 @@
         <w:pStyle w:val="BodyText"/>
       </w:pPr>
       <w:r>
-        <w:t xml:space="preserve">An 80:20 chronological split would be fixed before final testing: January 2001–December 2020 for estimation and January 2021–December 2025 for evaluation. Random splitting would be avoided because it leaks future information. This whole-season design was chosen over alternatives that break annual boundaries or reduce the available training history, thereby balancing seasonal integrity, parameter stability, and a demanding multi-year test.</w:t>
+        <w:t xml:space="preserve">An 80:20 chronological split would be used: January 2001–December 2020 for estimation and January 2021–December 2025 for evaluation. Random splitting would be avoided because it would leak future information into model development.</w:t>
       </w:r>
     </w:p>
     <w:p>
@@ -211,7 +211,7 @@
         <w:pStyle w:val="BodyText"/>
       </w:pPr>
       <w:r>
-        <w:t xml:space="preserve">The training series would be examined using time and seasonal plots, monthly summaries, decomposition, variance diagnostics, and differencing tests. Any need for a variance-stabilising transformation would be assessed from the training data by comparing transformed and untransformed diagnostics. This proposal-stage methodology specifies the decision process without reporting an estimated transformation value or other empirical outcome.</w:t>
+        <w:t xml:space="preserve">The training series would be examined using the original time-series plot, calendar-month distributions, monthly summaries, variance diagnostics, and differencing tests. Any need for a variance-stabilising transformation would be assessed from the training data by comparing transformed and untransformed diagnostics.</w:t>
       </w:r>
     </w:p>
     <w:p>
@@ -219,7 +219,7 @@
         <w:pStyle w:val="BodyText"/>
       </w:pPr>
       <w:r>
-        <w:t xml:space="preserve">Four basic forecasting models were selected for the research. ARIMA was selected because it can represent serial dependence and recurring patterns in a time series. Holt–Winters was selected because it can update the series level, trend, and seasonality through smoothing. ETS was selected because its state-space framework can represent changing components and forecast uncertainty. Linear regression was selected because it provides a clear and interpretable representation of trend and seasonal effects. Specific model variants, settings, and estimated parameters are reserved for the individual reports. Together, the four models provide broad coverage of serial-dependence, smoothing, state-space, and deterministic forecasting approaches</w:t>
+        <w:t xml:space="preserve">Four forecasting models would be evaluated. A manually specified SARIMA would represent serial dependence and recurring annual patterns, with its orders identified from training-only differencing and correlation diagnostics. Additive Holt–Winters without trend would represent level and additive seasonality without imposing a persistent trend. ETS would provide an innovations state-space approach in which the component forms and smoothing parameters could be estimated systematically. A basic structural model would be specified with a stochastic local level, a stochastic 12-month seasonal component, and irregular error, but no slope component, allowing gradual level movement without forcing a straight trend through the full record. Model-specific settings and estimated parameters would be reported in the individual reports. Together, the four models would compare seasonal correlation, smoothing, innovations state space, and structural state-space approaches</w:t>
       </w:r>
       <w:r>
         <w:t xml:space="preserve"> </w:t>
@@ -277,7 +277,7 @@
         <w:t xml:space="preserve"> </w:t>
       </w:r>
       <w:r>
-        <w:t xml:space="preserve">would indicate insufficient evidence against residual white noise. Test RMSE would be the primary ranking metric and MAE secondary, subject to white-noise diagnostics and non-negative forecasts. The analysis would be implemented reproducibly in R using the</w:t>
+        <w:t xml:space="preserve">would indicate insufficient evidence against residual white noise. The structural model’s first 12 diffuse-initialisation months would be excluded from its in-sample residual check. Test RMSE would be the primary ranking metric and MAE secondary, subject to white-noise diagnostics and non-negative forecasts. The established models would be implemented reproducibly in R using</w:t>
       </w:r>
       <w:r>
         <w:t xml:space="preserve"> </w:t>
@@ -289,10 +289,7 @@
         <w:t xml:space="preserve">forecast</w:t>
       </w:r>
       <w:r>
-        <w:t xml:space="preserve"> </w:t>
-      </w:r>
-      <w:r>
-        <w:t xml:space="preserve">and</w:t>
+        <w:t xml:space="preserve">; the structural model would be estimated by maximum likelihood with Python</w:t>
       </w:r>
       <w:r>
         <w:t xml:space="preserve"> </w:t>
@@ -301,26 +298,20 @@
         <w:rPr>
           <w:rStyle w:val="VerbatimChar"/>
         </w:rPr>
-        <w:t xml:space="preserve">jsonlite</w:t>
-      </w:r>
-      <w:r>
-        <w:t xml:space="preserve"> </w:t>
-      </w:r>
-      <w:r>
-        <w:t xml:space="preserve">packages</w:t>
-      </w:r>
-      <w:r>
-        <w:t xml:space="preserve"> </w:t>
-      </w:r>
-      <w:r>
-        <w:t xml:space="preserve">[6], [7]</w:t>
+        <w:t xml:space="preserve">statsmodels</w:t>
+      </w:r>
+      <w:r>
+        <w:t xml:space="preserve"> </w:t>
+      </w:r>
+      <w:r>
+        <w:t xml:space="preserve">[6], [7], [8]</w:t>
       </w:r>
       <w:r>
         <w:t xml:space="preserve">.</w:t>
       </w:r>
     </w:p>
     <w:bookmarkEnd w:id="23"/>
-    <w:bookmarkStart w:id="30" w:name="data-analysis"/>
+    <w:bookmarkStart w:id="27" w:name="data-analysis"/>
     <w:p>
       <w:pPr>
         <w:pStyle w:val="Heading1"/>
@@ -334,7 +325,7 @@
         <w:pStyle w:val="FirstParagraph"/>
       </w:pPr>
       <w:r>
-        <w:t xml:space="preserve">The complete series averaged 4.7927 kWh/m²/day (SD 0.4061; range 3.4478–5.9244). Calendar-month means show a marked annual cycle: March was highest (5.2456), while December was lowest (4.2005). The overview and STL panels indicate recurring seasonality with comparatively modest long-term movement.</w:t>
+        <w:t xml:space="preserve">The complete series averaged 4.7927 kWh/m²/day (SD 0.4061; range 3.4478–5.9244). Calendar-month means show a marked annual cycle: March was highest (5.2456), while December was lowest (4.2005). The original series fluctuates around a broadly stable long-run level, but shorter rises and falls mean that it should not be described as perfectly flat. The month-of-year distributions provide clearer evidence of recurring annual seasonality.</w:t>
       </w:r>
     </w:p>
     <w:p>
@@ -392,61 +383,6 @@
         <w:t xml:space="preserve">Monthly series and calendar-month distribution. The dashed line marks the January 2021 test boundary.</w:t>
       </w:r>
     </w:p>
-    <w:p>
-      <w:pPr>
-        <w:pStyle w:val="CaptionedFigure"/>
-      </w:pPr>
-      <w:r>
-        <w:drawing>
-          <wp:inline>
-            <wp:extent cx="2926080" cy="2560320"/>
-            <wp:effectExtent b="0" l="0" r="0" t="0"/>
-            <wp:docPr descr="STL trend, seasonal and remainder components, with the ACF of the STL remainder." title="" id="28" name="Picture"/>
-            <a:graphic>
-              <a:graphicData uri="http://schemas.openxmlformats.org/drawingml/2006/picture">
-                <pic:pic>
-                  <pic:nvPicPr>
-                    <pic:cNvPr descr="../analysis_outputs/nasa/figures/nasa_decomposition_diagnostics.png" id="29" name="Picture"/>
-                    <pic:cNvPicPr>
-                      <a:picLocks noChangeArrowheads="1" noChangeAspect="1"/>
-                    </pic:cNvPicPr>
-                  </pic:nvPicPr>
-                  <pic:blipFill>
-                    <a:blip r:embed="rId27"/>
-                    <a:stretch>
-                      <a:fillRect/>
-                    </a:stretch>
-                  </pic:blipFill>
-                  <pic:spPr bwMode="auto">
-                    <a:xfrm>
-                      <a:off x="0" y="0"/>
-                      <a:ext cx="2926080" cy="2560320"/>
-                    </a:xfrm>
-                    <a:prstGeom prst="rect">
-                      <a:avLst/>
-                    </a:prstGeom>
-                    <a:noFill/>
-                    <a:ln w="9525">
-                      <a:noFill/>
-                      <a:headEnd/>
-                      <a:tailEnd/>
-                    </a:ln>
-                  </pic:spPr>
-                </pic:pic>
-              </a:graphicData>
-            </a:graphic>
-          </wp:inline>
-        </w:drawing>
-      </w:r>
-    </w:p>
-    <w:p>
-      <w:pPr>
-        <w:pStyle w:val="ImageCaption"/>
-      </w:pPr>
-      <w:r>
-        <w:t xml:space="preserve">STL trend, seasonal and remainder components, with the ACF of the STL remainder.</w:t>
-      </w:r>
-    </w:p>
     <w:tbl>
       <w:tblPr>
         <w:tblStyle w:val="Table"/>
@@ -455,13 +391,10 @@
         <w:tblLook w:firstRow="1" w:lastRow="0" w:firstColumn="0" w:lastColumn="0" w:noHBand="0" w:noVBand="0" w:val="0020"/>
       </w:tblPr>
       <w:tblGrid>
-        <w:gridCol w:w="880"/>
-        <w:gridCol w:w="1173"/>
-        <w:gridCol w:w="1173"/>
-        <w:gridCol w:w="1173"/>
-        <w:gridCol w:w="1173"/>
-        <w:gridCol w:w="1173"/>
-        <w:gridCol w:w="1173"/>
+        <w:gridCol w:w="1821"/>
+        <w:gridCol w:w="3088"/>
+        <w:gridCol w:w="1504"/>
+        <w:gridCol w:w="1504"/>
       </w:tblGrid>
       <w:tr>
         <w:trPr>
@@ -475,30 +408,6 @@
             </w:pPr>
             <w:r>
               <w:t xml:space="preserve">Model</w:t>
-            </w:r>
-          </w:p>
-        </w:tc>
-        <w:tc>
-          <w:tcPr/>
-          <w:p>
-            <w:pPr>
-              <w:pStyle w:val="Compact"/>
-              <w:jc w:val="right"/>
-            </w:pPr>
-            <w:r>
-              <w:t xml:space="preserve">ME</w:t>
-            </w:r>
-          </w:p>
-        </w:tc>
-        <w:tc>
-          <w:tcPr/>
-          <w:p>
-            <w:pPr>
-              <w:pStyle w:val="Compact"/>
-              <w:jc w:val="right"/>
-            </w:pPr>
-            <w:r>
-              <w:t xml:space="preserve">MSE</w:t>
             </w:r>
           </w:p>
         </w:tc>
@@ -533,21 +442,34 @@
               <w:pStyle w:val="Compact"/>
               <w:jc w:val="right"/>
             </w:pPr>
+            <m:oMath>
+              <m:r>
+                <m:t>Q</m:t>
+              </m:r>
+              <m:r>
+                <m:rPr>
+                  <m:sty m:val="p"/>
+                </m:rPr>
+                <m:t>(</m:t>
+              </m:r>
+              <m:r>
+                <m:t>24</m:t>
+              </m:r>
+              <m:r>
+                <m:rPr>
+                  <m:sty m:val="p"/>
+                </m:rPr>
+                <m:t>)</m:t>
+              </m:r>
+            </m:oMath>
             <w:r>
-              <w:t xml:space="preserve">MPE</w:t>
+              <w:t xml:space="preserve"> </w:t>
             </w:r>
-          </w:p>
-        </w:tc>
-        <w:tc>
-          <w:tcPr/>
-          <w:p>
-            <w:pPr>
-              <w:pStyle w:val="Compact"/>
-              <w:jc w:val="right"/>
-            </w:pPr>
-            <w:r>
-              <w:t xml:space="preserve">MAPE</w:t>
-            </w:r>
+            <m:oMath>
+              <m:r>
+                <m:t>p</m:t>
+              </m:r>
+            </m:oMath>
           </w:p>
         </w:tc>
       </w:tr>
@@ -571,7 +493,7 @@
               <w:jc w:val="right"/>
             </w:pPr>
             <w:r>
-              <w:t xml:space="preserve">−0.0566</w:t>
+              <w:t xml:space="preserve">0.2850</w:t>
             </w:r>
           </w:p>
         </w:tc>
@@ -583,7 +505,7 @@
               <w:jc w:val="right"/>
             </w:pPr>
             <w:r>
-              <w:t xml:space="preserve">0.0857</w:t>
+              <w:t xml:space="preserve">0.2198</w:t>
             </w:r>
           </w:p>
         </w:tc>
@@ -595,43 +517,7 @@
               <w:jc w:val="right"/>
             </w:pPr>
             <w:r>
-              <w:t xml:space="preserve">0.2928</w:t>
-            </w:r>
-          </w:p>
-        </w:tc>
-        <w:tc>
-          <w:tcPr/>
-          <w:p>
-            <w:pPr>
-              <w:pStyle w:val="Compact"/>
-              <w:jc w:val="right"/>
-            </w:pPr>
-            <w:r>
-              <w:t xml:space="preserve">0.2245</w:t>
-            </w:r>
-          </w:p>
-        </w:tc>
-        <w:tc>
-          <w:tcPr/>
-          <w:p>
-            <w:pPr>
-              <w:pStyle w:val="Compact"/>
-              <w:jc w:val="right"/>
-            </w:pPr>
-            <w:r>
-              <w:t xml:space="preserve">−1.4643%</w:t>
-            </w:r>
-          </w:p>
-        </w:tc>
-        <w:tc>
-          <w:tcPr/>
-          <w:p>
-            <w:pPr>
-              <w:pStyle w:val="Compact"/>
-              <w:jc w:val="right"/>
-            </w:pPr>
-            <w:r>
-              <w:t xml:space="preserve">4.7346%</w:t>
+              <w:t xml:space="preserve">0.1046</w:t>
             </w:r>
           </w:p>
         </w:tc>
@@ -645,30 +531,6 @@
             </w:pPr>
             <w:r>
               <w:t xml:space="preserve">ETS</w:t>
-            </w:r>
-          </w:p>
-        </w:tc>
-        <w:tc>
-          <w:tcPr/>
-          <w:p>
-            <w:pPr>
-              <w:pStyle w:val="Compact"/>
-              <w:jc w:val="right"/>
-            </w:pPr>
-            <w:r>
-              <w:t xml:space="preserve">−0.0847</w:t>
-            </w:r>
-          </w:p>
-        </w:tc>
-        <w:tc>
-          <w:tcPr/>
-          <w:p>
-            <w:pPr>
-              <w:pStyle w:val="Compact"/>
-              <w:jc w:val="right"/>
-            </w:pPr>
-            <w:r>
-              <w:t xml:space="preserve">0.0869</w:t>
             </w:r>
           </w:p>
         </w:tc>
@@ -704,19 +566,7 @@
               <w:jc w:val="right"/>
             </w:pPr>
             <w:r>
-              <w:t xml:space="preserve">−2.0546%</w:t>
-            </w:r>
-          </w:p>
-        </w:tc>
-        <w:tc>
-          <w:tcPr/>
-          <w:p>
-            <w:pPr>
-              <w:pStyle w:val="Compact"/>
-              <w:jc w:val="right"/>
-            </w:pPr>
-            <w:r>
-              <w:t xml:space="preserve">4.9673%</w:t>
+              <w:t xml:space="preserve">0.0720</w:t>
             </w:r>
           </w:p>
         </w:tc>
@@ -729,7 +579,7 @@
               <w:pStyle w:val="Compact"/>
             </w:pPr>
             <w:r>
-              <w:t xml:space="preserve">Trend + season</w:t>
+              <w:t xml:space="preserve">BSM</w:t>
             </w:r>
           </w:p>
         </w:tc>
@@ -741,7 +591,7 @@
               <w:jc w:val="right"/>
             </w:pPr>
             <w:r>
-              <w:t xml:space="preserve">−0.0989</w:t>
+              <w:t xml:space="preserve">0.2951</w:t>
             </w:r>
           </w:p>
         </w:tc>
@@ -753,7 +603,7 @@
               <w:jc w:val="right"/>
             </w:pPr>
             <w:r>
-              <w:t xml:space="preserve">0.0893</w:t>
+              <w:t xml:space="preserve">0.2370</w:t>
             </w:r>
           </w:p>
         </w:tc>
@@ -765,43 +615,7 @@
               <w:jc w:val="right"/>
             </w:pPr>
             <w:r>
-              <w:t xml:space="preserve">0.2988</w:t>
-            </w:r>
-          </w:p>
-        </w:tc>
-        <w:tc>
-          <w:tcPr/>
-          <w:p>
-            <w:pPr>
-              <w:pStyle w:val="Compact"/>
-              <w:jc w:val="right"/>
-            </w:pPr>
-            <w:r>
-              <w:t xml:space="preserve">0.2414</w:t>
-            </w:r>
-          </w:p>
-        </w:tc>
-        <w:tc>
-          <w:tcPr/>
-          <w:p>
-            <w:pPr>
-              <w:pStyle w:val="Compact"/>
-              <w:jc w:val="right"/>
-            </w:pPr>
-            <w:r>
-              <w:t xml:space="preserve">−2.3584%</w:t>
-            </w:r>
-          </w:p>
-        </w:tc>
-        <w:tc>
-          <w:tcPr/>
-          <w:p>
-            <w:pPr>
-              <w:pStyle w:val="Compact"/>
-              <w:jc w:val="right"/>
-            </w:pPr>
-            <w:r>
-              <w:t xml:space="preserve">5.1093%</w:t>
+              <w:t xml:space="preserve">0.0670</w:t>
             </w:r>
           </w:p>
         </w:tc>
@@ -814,31 +628,7 @@
               <w:pStyle w:val="Compact"/>
             </w:pPr>
             <w:r>
-              <w:t xml:space="preserve">Holt–Winters</w:t>
-            </w:r>
-          </w:p>
-        </w:tc>
-        <w:tc>
-          <w:tcPr/>
-          <w:p>
-            <w:pPr>
-              <w:pStyle w:val="Compact"/>
-              <w:jc w:val="right"/>
-            </w:pPr>
-            <w:r>
-              <w:t xml:space="preserve">−0.1037</w:t>
-            </w:r>
-          </w:p>
-        </w:tc>
-        <w:tc>
-          <w:tcPr/>
-          <w:p>
-            <w:pPr>
-              <w:pStyle w:val="Compact"/>
-              <w:jc w:val="right"/>
-            </w:pPr>
-            <w:r>
-              <w:t xml:space="preserve">0.0962</w:t>
+              <w:t xml:space="preserve">HW</w:t>
             </w:r>
           </w:p>
         </w:tc>
@@ -874,19 +664,7 @@
               <w:jc w:val="right"/>
             </w:pPr>
             <w:r>
-              <w:t xml:space="preserve">−2.4553%</w:t>
-            </w:r>
-          </w:p>
-        </w:tc>
-        <w:tc>
-          <w:tcPr/>
-          <w:p>
-            <w:pPr>
-              <w:pStyle w:val="Compact"/>
-              <w:jc w:val="right"/>
-            </w:pPr>
-            <w:r>
-              <w:t xml:space="preserve">5.2213%</w:t>
+              <w:t xml:space="preserve">0.1491</w:t>
             </w:r>
           </w:p>
         </w:tc>
@@ -897,7 +675,17 @@
         <w:pStyle w:val="BodyText"/>
       </w:pPr>
       <w:r>
-        <w:t xml:space="preserve">On the common test period, SARIMA had the lowest MSE, RMSE, MAE, and MAPE and the ME and MPE closest to zero. Negative ME and MPE for every model indicate average overforecasting under the declared</w:t>
+        <w:rPr>
+          <w:i/>
+          <w:iCs/>
+        </w:rPr>
+        <w:t xml:space="preserve">BSM: basic structural model; HW: Holt–Winters. The full evidence also includes ME, MSE, MPE, and MAPE.</w:t>
+      </w:r>
+      <w:r>
+        <w:t xml:space="preserve"> </w:t>
+      </w:r>
+      <w:r>
+        <w:t xml:space="preserve">On the common test period, the manually identified SARIMA had the lowest MSE, RMSE, MAE, and MAPE and the ME and MPE closest to zero. Negative ME and MPE for every model indicate average overforecasting under the declared</w:t>
       </w:r>
       <w:r>
         <w:t xml:space="preserve"> </w:t>
@@ -920,33 +708,7 @@
         <w:pStyle w:val="BodyText"/>
       </w:pPr>
       <w:r>
-        <w:t xml:space="preserve">ARIMA ranked first and passed the diagnostic and physical-plausibility gates. Its RMSE was only 0.0019 kWh/m²/day (0.65%) below ETS, so the predictive advantage is modest rather than decisive. ETS was a statistically acceptable close second. Holt–Winters also passed its white-noise test but produced the largest errors. Linear regression ranked third by RMSE but failed the residual eligibility condition because material serial dependence remained.</w:t>
-      </w:r>
-    </w:p>
-    <w:p>
-      <w:pPr>
-        <w:pStyle w:val="BodyText"/>
-      </w:pPr>
-      <w:r>
-        <w:t xml:space="preserve">The selected ARIMA model represents recurring annual patterns and serial dependence in the irradiance series. After selection, it was refitted using the complete dataset to produce the 2026 forecasts. These future forecasts were not used in the 2021–2025 model comparison.</w:t>
-      </w:r>
-    </w:p>
-    <w:bookmarkEnd w:id="30"/>
-    <w:bookmarkStart w:id="46" w:name="conclusion"/>
-    <w:p>
-      <w:pPr>
-        <w:pStyle w:val="Heading1"/>
-      </w:pPr>
-      <w:r>
-        <w:t xml:space="preserve">Conclusion</w:t>
-      </w:r>
-    </w:p>
-    <w:p>
-      <w:pPr>
-        <w:pStyle w:val="FirstParagraph"/>
-      </w:pPr>
-      <w:r>
-        <w:t xml:space="preserve">ARIMA provided the strongest admissible result for this dataset: RMSE 0.2928, MAE 0.2245, and Ljung–Box</w:t>
+        <w:t xml:space="preserve">SARIMA ranked first and passed the diagnostic and physical-plausibility gates. Its RMSE was 0.0097 kWh/m²/day (3.30%) below ETS and 0.0101 kWh/m²/day (3.42%) below the structural model, so the advantage is useful but sample-specific. ETS was a statistically acceptable second. The structural model ranked third and narrowly passed the white-noise gate (Ljung–Box</w:t>
       </w:r>
       <w:r>
         <w:t xml:space="preserve"> </w:t>
@@ -962,11 +724,57 @@
           <m:t>=</m:t>
         </m:r>
         <m:r>
-          <m:t>0.2129</m:t>
+          <m:t>0.0670</m:t>
         </m:r>
       </m:oMath>
       <w:r>
-        <w:t xml:space="preserve">. Its narrow advantage over ETS shows that the conclusion should be treated as a defensible selection for the present sample, not evidence of universal superiority. The pattern supports annual seasonality and serial dependence, while the uncertain regression trend cautions against asserting strong long-run growth.</w:t>
+        <w:t xml:space="preserve">); all its test forecasts were non-negative. Holt–Winters also passed its white-noise test but produced the largest errors. The structural model’s estimated seasonal variance was effectively zero, indicating that its seasonal pattern behaved as fixed after initialisation rather than evolving materially; this boundary estimate limits claims about changing seasonality.</w:t>
+      </w:r>
+    </w:p>
+    <w:p>
+      <w:pPr>
+        <w:pStyle w:val="BodyText"/>
+      </w:pPr>
+      <w:r>
+        <w:t xml:space="preserve">The selected SARIMA model represents recurring annual patterns and serial dependence in the irradiance series. After selection, its locked training specification was refitted using the complete dataset to produce the 2026 forecasts. These future forecasts were not used in the 2021–2025 model comparison.</w:t>
+      </w:r>
+    </w:p>
+    <w:bookmarkEnd w:id="27"/>
+    <w:bookmarkStart w:id="45" w:name="conclusion"/>
+    <w:p>
+      <w:pPr>
+        <w:pStyle w:val="Heading1"/>
+      </w:pPr>
+      <w:r>
+        <w:t xml:space="preserve">Conclusion</w:t>
+      </w:r>
+    </w:p>
+    <w:p>
+      <w:pPr>
+        <w:pStyle w:val="FirstParagraph"/>
+      </w:pPr>
+      <w:r>
+        <w:t xml:space="preserve">SARIMA provided the strongest admissible result for this dataset: RMSE 0.2850, MAE 0.2198, and Ljung–Box</w:t>
+      </w:r>
+      <w:r>
+        <w:t xml:space="preserve"> </w:t>
+      </w:r>
+      <m:oMath>
+        <m:r>
+          <m:t>p</m:t>
+        </m:r>
+        <m:r>
+          <m:rPr>
+            <m:sty m:val="p"/>
+          </m:rPr>
+          <m:t>=</m:t>
+        </m:r>
+        <m:r>
+          <m:t>0.1046</m:t>
+        </m:r>
+      </m:oMath>
+      <w:r>
+        <w:t xml:space="preserve">. Its advantage over ETS and the basic structural model should be treated as a defensible selection for the present sample, not evidence of universal superiority. The graph and fitted structural model support annual seasonality around a slowly changing level, but they do not establish a sustained long-run increase or decrease.</w:t>
       </w:r>
     </w:p>
     <w:p>
@@ -1037,8 +845,8 @@
         <w:t xml:space="preserve">References</w:t>
       </w:r>
     </w:p>
-    <w:bookmarkStart w:id="45" w:name="refs"/>
-    <w:bookmarkStart w:id="32" w:name="ref-nasa-power-monthly"/>
+    <w:bookmarkStart w:id="44" w:name="refs"/>
+    <w:bookmarkStart w:id="29" w:name="ref-nasa-power-monthly"/>
     <w:p>
       <w:pPr>
         <w:pStyle w:val="Bibliography"/>
@@ -1067,7 +875,7 @@
       <w:r>
         <w:t xml:space="preserve"> </w:t>
       </w:r>
-      <w:hyperlink r:id="rId31">
+      <w:hyperlink r:id="rId28">
         <w:r>
           <w:rPr>
             <w:rStyle w:val="Hyperlink"/>
@@ -1076,8 +884,8 @@
         </w:r>
       </w:hyperlink>
     </w:p>
-    <w:bookmarkEnd w:id="32"/>
-    <w:bookmarkStart w:id="34" w:name="ref-un-sdg7"/>
+    <w:bookmarkEnd w:id="29"/>
+    <w:bookmarkStart w:id="31" w:name="ref-un-sdg7"/>
     <w:p>
       <w:pPr>
         <w:pStyle w:val="Bibliography"/>
@@ -1106,7 +914,7 @@
       <w:r>
         <w:t xml:space="preserve"> </w:t>
       </w:r>
-      <w:hyperlink r:id="rId33">
+      <w:hyperlink r:id="rId30">
         <w:r>
           <w:rPr>
             <w:rStyle w:val="Hyperlink"/>
@@ -1115,8 +923,8 @@
         </w:r>
       </w:hyperlink>
     </w:p>
-    <w:bookmarkEnd w:id="34"/>
-    <w:bookmarkStart w:id="36" w:name="ref-hyndman-athanasopoulos-2021"/>
+    <w:bookmarkEnd w:id="31"/>
+    <w:bookmarkStart w:id="33" w:name="ref-hyndman-athanasopoulos-2021"/>
     <w:p>
       <w:pPr>
         <w:pStyle w:val="Bibliography"/>
@@ -1149,7 +957,7 @@
       <w:r>
         <w:t xml:space="preserve"> </w:t>
       </w:r>
-      <w:hyperlink r:id="rId35">
+      <w:hyperlink r:id="rId32">
         <w:r>
           <w:rPr>
             <w:rStyle w:val="Hyperlink"/>
@@ -1158,8 +966,8 @@
         </w:r>
       </w:hyperlink>
     </w:p>
-    <w:bookmarkEnd w:id="36"/>
-    <w:bookmarkStart w:id="38" w:name="ref-hyndman-khandakar-2008"/>
+    <w:bookmarkEnd w:id="33"/>
+    <w:bookmarkStart w:id="35" w:name="ref-hyndman-khandakar-2008"/>
     <w:p>
       <w:pPr>
         <w:pStyle w:val="Bibliography"/>
@@ -1201,7 +1009,7 @@
       <w:r>
         <w:t xml:space="preserve"> </w:t>
       </w:r>
-      <w:hyperlink r:id="rId37">
+      <w:hyperlink r:id="rId34">
         <w:r>
           <w:rPr>
             <w:rStyle w:val="Hyperlink"/>
@@ -1213,8 +1021,8 @@
         <w:t xml:space="preserve">.</w:t>
       </w:r>
     </w:p>
-    <w:bookmarkEnd w:id="38"/>
-    <w:bookmarkStart w:id="40" w:name="ref-forecast-residuals"/>
+    <w:bookmarkEnd w:id="35"/>
+    <w:bookmarkStart w:id="37" w:name="ref-forecast-residuals"/>
     <w:p>
       <w:pPr>
         <w:pStyle w:val="Bibliography"/>
@@ -1243,7 +1051,7 @@
       <w:r>
         <w:t xml:space="preserve"> </w:t>
       </w:r>
-      <w:hyperlink r:id="rId39">
+      <w:hyperlink r:id="rId36">
         <w:r>
           <w:rPr>
             <w:rStyle w:val="Hyperlink"/>
@@ -1252,8 +1060,8 @@
         </w:r>
       </w:hyperlink>
     </w:p>
-    <w:bookmarkEnd w:id="40"/>
-    <w:bookmarkStart w:id="42" w:name="ref-forecast-package"/>
+    <w:bookmarkEnd w:id="37"/>
+    <w:bookmarkStart w:id="39" w:name="ref-forecast-package"/>
     <w:p>
       <w:pPr>
         <w:pStyle w:val="Bibliography"/>
@@ -1299,7 +1107,7 @@
       <w:r>
         <w:t xml:space="preserve"> </w:t>
       </w:r>
-      <w:hyperlink r:id="rId41">
+      <w:hyperlink r:id="rId38">
         <w:r>
           <w:rPr>
             <w:rStyle w:val="Hyperlink"/>
@@ -1308,8 +1116,8 @@
         </w:r>
       </w:hyperlink>
     </w:p>
-    <w:bookmarkEnd w:id="42"/>
-    <w:bookmarkStart w:id="44" w:name="ref-r-core-2026"/>
+    <w:bookmarkEnd w:id="39"/>
+    <w:bookmarkStart w:id="41" w:name="ref-r-core-2026"/>
     <w:p>
       <w:pPr>
         <w:pStyle w:val="Bibliography"/>
@@ -1342,7 +1150,7 @@
       <w:r>
         <w:t xml:space="preserve"> </w:t>
       </w:r>
-      <w:hyperlink r:id="rId43">
+      <w:hyperlink r:id="rId40">
         <w:r>
           <w:rPr>
             <w:rStyle w:val="Hyperlink"/>
@@ -1351,9 +1159,64 @@
         </w:r>
       </w:hyperlink>
     </w:p>
+    <w:bookmarkEnd w:id="41"/>
+    <w:bookmarkStart w:id="43" w:name="ref-seabold-perktold-2010"/>
+    <w:p>
+      <w:pPr>
+        <w:pStyle w:val="Bibliography"/>
+      </w:pPr>
+      <w:r>
+        <w:t xml:space="preserve">[8]</w:t>
+      </w:r>
+      <w:r>
+        <w:t xml:space="preserve"> </w:t>
+      </w:r>
+      <w:r>
+        <w:t xml:space="preserve">	</w:t>
+      </w:r>
+      <w:r>
+        <w:t xml:space="preserve">S. Seabold and J. Perktold,</w:t>
+      </w:r>
+      <w:r>
+        <w:t xml:space="preserve"> </w:t>
+      </w:r>
+      <w:r>
+        <w:t xml:space="preserve">‘Statsmodels: Econometric and statistical modeling with python’</w:t>
+      </w:r>
+      <w:r>
+        <w:t xml:space="preserve">, in</w:t>
+      </w:r>
+      <w:r>
+        <w:t xml:space="preserve"> </w:t>
+      </w:r>
+      <w:r>
+        <w:rPr>
+          <w:i/>
+          <w:iCs/>
+        </w:rPr>
+        <w:t xml:space="preserve">Proceedings of the 9th python in science conference</w:t>
+      </w:r>
+      <w:r>
+        <w:t xml:space="preserve">, 2010, pp. 92–96. doi:</w:t>
+      </w:r>
+      <w:r>
+        <w:t xml:space="preserve"> </w:t>
+      </w:r>
+      <w:hyperlink r:id="rId42">
+        <w:r>
+          <w:rPr>
+            <w:rStyle w:val="Hyperlink"/>
+          </w:rPr>
+          <w:t xml:space="preserve">10.25080/Majora-92bf1922-011</w:t>
+        </w:r>
+      </w:hyperlink>
+      <w:r>
+        <w:t xml:space="preserve">.</w:t>
+      </w:r>
+    </w:p>
+    <w:bookmarkEnd w:id="43"/>
     <w:bookmarkEnd w:id="44"/>
     <w:bookmarkEnd w:id="45"/>
-    <w:bookmarkEnd w:id="46"/>
     <w:sectPr>
       <w:headerReference r:id="rId8" w:type="even"/>
       <w:headerReference r:id="rId9" w:type="default"/>
@@ -3504,7 +3367,7 @@
     </w:pPr>
     <w:rPr>
       <w:spacing w:val="-1"/>
-      <w:lang w:eastAsia="x-none" w:val="x-none"/>
+      <w:lang w:eastAsia="x-none" w:val="en-GB"/>
     </w:rPr>
   </w:style>
   <w:style w:customStyle="1" w:styleId="BodyTextChar" w:type="character">
@@ -3513,7 +3376,7 @@
     <w:rsid w:val="00E7596C"/>
     <w:rPr>
       <w:spacing w:val="-1"/>
-      <w:lang w:eastAsia="x-none" w:val="x-none"/>
+      <w:lang w:eastAsia="x-none" w:val="en-GB"/>
     </w:rPr>
   </w:style>
   <w:style w:customStyle="1" w:styleId="bulletlist" w:type="paragraph">

</xml_diff>